<commit_message>
Atualização do cache do Firebase Hosting, inclusão da página de relatórios acessível apenas para administradores e gerentes, e ajustes no template do relatório, simplificando o cabeçalho. Essas mudanças visam melhorar a organização do código e a experiência do usuário.
</commit_message>
<xml_diff>
--- a/public/templates/template - Copia.docx
+++ b/public/templates/template - Copia.docx
@@ -26,23 +26,7 @@
           <w:sz w:val="44"/>
           <w:szCs w:val="44"/>
         </w:rPr>
-        <w:t xml:space="preserve">RELATÓRIO </w:t>
-      </w:r>
-      <w:r>
-        <w:rPr>
-          <w:color w:val="2F5496"/>
-          <w:sz w:val="44"/>
-          <w:szCs w:val="44"/>
-        </w:rPr>
-        <w:t>SEMANAL</w:t>
-      </w:r>
-      <w:r>
-        <w:rPr>
-          <w:color w:val="2F5496"/>
-          <w:sz w:val="44"/>
-          <w:szCs w:val="44"/>
-        </w:rPr>
-        <w:t xml:space="preserve"> DOS </w:t>
+        <w:t xml:space="preserve">RELATÓRIO DOS </w:t>
       </w:r>
     </w:p>
     <w:p>
@@ -445,146 +429,6 @@
         </w:rPr>
         <w:t>, integrante a este documento, a listagem dos itens descritos de forma pormenorizada.</w:t>
       </w:r>
-    </w:p>
-    <w:p>
-      <w:pPr>
-        <w:jc w:val="both"/>
-        <w:rPr>
-          <w:rFonts w:ascii="Arial" w:eastAsia="Arial" w:hAnsi="Arial" w:cs="Arial"/>
-          <w:sz w:val="24"/>
-          <w:szCs w:val="24"/>
-        </w:rPr>
-      </w:pPr>
-    </w:p>
-    <w:p>
-      <w:pPr>
-        <w:jc w:val="both"/>
-        <w:rPr>
-          <w:rFonts w:ascii="Arial" w:eastAsia="Arial" w:hAnsi="Arial" w:cs="Arial"/>
-          <w:sz w:val="24"/>
-          <w:szCs w:val="24"/>
-        </w:rPr>
-      </w:pPr>
-    </w:p>
-    <w:p>
-      <w:pPr>
-        <w:jc w:val="both"/>
-        <w:rPr>
-          <w:rFonts w:ascii="Arial" w:eastAsia="Arial" w:hAnsi="Arial" w:cs="Arial"/>
-          <w:sz w:val="24"/>
-          <w:szCs w:val="24"/>
-        </w:rPr>
-      </w:pPr>
-    </w:p>
-    <w:p>
-      <w:pPr>
-        <w:jc w:val="both"/>
-        <w:rPr>
-          <w:rFonts w:ascii="Arial" w:eastAsia="Arial" w:hAnsi="Arial" w:cs="Arial"/>
-          <w:sz w:val="24"/>
-          <w:szCs w:val="24"/>
-        </w:rPr>
-      </w:pPr>
-    </w:p>
-    <w:p>
-      <w:pPr>
-        <w:jc w:val="both"/>
-        <w:rPr>
-          <w:rFonts w:ascii="Arial" w:eastAsia="Arial" w:hAnsi="Arial" w:cs="Arial"/>
-          <w:sz w:val="24"/>
-          <w:szCs w:val="24"/>
-        </w:rPr>
-      </w:pPr>
-    </w:p>
-    <w:p>
-      <w:pPr>
-        <w:jc w:val="both"/>
-        <w:rPr>
-          <w:rFonts w:ascii="Arial" w:eastAsia="Arial" w:hAnsi="Arial" w:cs="Arial"/>
-          <w:sz w:val="24"/>
-          <w:szCs w:val="24"/>
-        </w:rPr>
-      </w:pPr>
-    </w:p>
-    <w:p>
-      <w:pPr>
-        <w:jc w:val="both"/>
-        <w:rPr>
-          <w:rFonts w:ascii="Arial" w:eastAsia="Arial" w:hAnsi="Arial" w:cs="Arial"/>
-          <w:sz w:val="24"/>
-          <w:szCs w:val="24"/>
-        </w:rPr>
-      </w:pPr>
-    </w:p>
-    <w:p>
-      <w:pPr>
-        <w:jc w:val="both"/>
-        <w:rPr>
-          <w:rFonts w:ascii="Arial" w:eastAsia="Arial" w:hAnsi="Arial" w:cs="Arial"/>
-          <w:sz w:val="24"/>
-          <w:szCs w:val="24"/>
-        </w:rPr>
-      </w:pPr>
-    </w:p>
-    <w:p>
-      <w:pPr>
-        <w:jc w:val="both"/>
-        <w:rPr>
-          <w:rFonts w:ascii="Arial" w:eastAsia="Arial" w:hAnsi="Arial" w:cs="Arial"/>
-          <w:sz w:val="24"/>
-          <w:szCs w:val="24"/>
-        </w:rPr>
-      </w:pPr>
-    </w:p>
-    <w:p>
-      <w:pPr>
-        <w:jc w:val="both"/>
-        <w:rPr>
-          <w:rFonts w:ascii="Arial" w:eastAsia="Arial" w:hAnsi="Arial" w:cs="Arial"/>
-          <w:sz w:val="24"/>
-          <w:szCs w:val="24"/>
-        </w:rPr>
-      </w:pPr>
-    </w:p>
-    <w:p>
-      <w:pPr>
-        <w:jc w:val="both"/>
-        <w:rPr>
-          <w:rFonts w:ascii="Arial" w:eastAsia="Arial" w:hAnsi="Arial" w:cs="Arial"/>
-          <w:sz w:val="24"/>
-          <w:szCs w:val="24"/>
-        </w:rPr>
-      </w:pPr>
-    </w:p>
-    <w:p>
-      <w:pPr>
-        <w:jc w:val="both"/>
-        <w:rPr>
-          <w:rFonts w:ascii="Arial" w:eastAsia="Arial" w:hAnsi="Arial" w:cs="Arial"/>
-          <w:sz w:val="24"/>
-          <w:szCs w:val="24"/>
-        </w:rPr>
-      </w:pPr>
-    </w:p>
-    <w:p>
-      <w:pPr>
-        <w:jc w:val="both"/>
-        <w:rPr>
-          <w:rFonts w:ascii="Arial" w:eastAsia="Arial" w:hAnsi="Arial" w:cs="Arial"/>
-          <w:sz w:val="24"/>
-          <w:szCs w:val="24"/>
-        </w:rPr>
-      </w:pPr>
-    </w:p>
-    <w:p>
-      <w:pPr>
-        <w:jc w:val="both"/>
-        <w:rPr>
-          <w:rFonts w:ascii="Arial" w:eastAsia="Arial" w:hAnsi="Arial" w:cs="Arial"/>
-          <w:sz w:val="24"/>
-          <w:szCs w:val="24"/>
-        </w:rPr>
-      </w:pPr>
     </w:p>
     <w:p>
       <w:pPr>

</xml_diff>